<commit_message>
feat: tutup F11/F14/F18 (klaim karbon 4-mata, QR HMAC + cek offline, HP bersama) & perbaikan CHECK SQLite
- F11: migrasi 017 carbon_claims (snapshot SHA-256, lab C-org & H/C-org wajib, kunci serah-terima
  UNIQUE, periode tidak tumpang-tindih), putusan auditor dengan RLS, KPI ESG G6, UI klaim
- F14: QR BIO-XXXXXXXX-TTTTTT bertanda tangan HMAC (QR_HMAC_KEY), digest offline di rute supir,
  QR lama ditandai QR_LAMA via logistik.qr_legacy_policy
- F18: antrean/foto/GPS terikat user_id, cache rute per pengguna, pemberitahuan data milik akun lain
- SQLite: pembaruan CHECK lama (ck_fpay_net) agar pelunasan ber-DP tidak ditolak "kirim ganda"
- docs/14 serah-terima, docs/06 §7 & runbook diperbarui; sw v11

Co-Authored-By: Claude Opus 5.5 <noreply@anthropic.com>
</commit_message>
<xml_diff>
--- a/docs/06_AUDIT_SOP_LAPANGAN_GREEN_LOGISTICS.docx
+++ b/docs/06_AUDIT_SOP_LAPANGAN_GREEN_LOGISTICS.docx
@@ -729,7 +729,7 @@
                 <w:color w:val="212121"/>
                 <w:sz w:val="19"/>
               </w:rPr>
-              <w:t>19 temuan (F1–F19): 16 ditutup/ditutup-dasar di kode; F11, F14, F18 masih sebagian</w:t>
+              <w:t>19 temuan (F1–F19): semua ditutup/ditutup-dasar di kode (F11, F14, F18 ditutup 11 Okt 2026; OTP F6 opsional)</w:t>
             </w:r>
           </w:p>
         </w:tc>
@@ -7948,17 +7948,37 @@
                 <w:color w:val="212121"/>
                 <w:sz w:val="19"/>
               </w:rPr>
-              <w:t>Sebagian.</w:t>
-            </w:r>
-            <w:r>
-              <w:rPr>
-                <w:rFonts w:ascii="Calibri" w:hAnsi="Calibri"/>
-                <w:b w:val="0"/>
-                <w:i w:val="0"/>
-                <w:color w:val="212121"/>
-                <w:sz w:val="19"/>
-              </w:rPr>
-              <w:t xml:space="preserve"> Green Scorecard dihitung dari batch nyata, berlabel "estimasi, bukan kredit". Lanjutan: workflow verifikator (L).</w:t>
+              <w:t>Ditutup.</w:t>
+            </w:r>
+            <w:r>
+              <w:rPr>
+                <w:rFonts w:ascii="Calibri" w:hAnsi="Calibri"/>
+                <w:b w:val="0"/>
+                <w:i w:val="0"/>
+                <w:color w:val="212121"/>
+                <w:sz w:val="19"/>
+              </w:rPr>
+              <w:t xml:space="preserve"> Alur klaim removal (migrasi 017): pabrik mengajukan per periode dengan hasil lab C-org &amp; H/C-org (wajib; H/C-org &gt; </w:t>
+            </w:r>
+            <w:r>
+              <w:rPr>
+                <w:rFonts w:ascii="Consolas" w:hAnsi="Consolas"/>
+                <w:b w:val="0"/>
+                <w:i w:val="0"/>
+                <w:color w:val="00695C"/>
+                <w:sz w:val="18"/>
+              </w:rPr>
+              <w:t>karbon.h_corg_max</w:t>
+            </w:r>
+            <w:r>
+              <w:rPr>
+                <w:rFonts w:ascii="Calibri" w:hAnsi="Calibri"/>
+                <w:b w:val="0"/>
+                <w:i w:val="0"/>
+                <w:color w:val="212121"/>
+                <w:sz w:val="19"/>
+              </w:rPr>
+              <w:t xml:space="preserve"> 0,7 ditolak) → snapshot hitungan + parameter dibekukan SHA-256 → auditor (bukan pengaju, bukan admin) memverifikasi/menolak dengan alasan. Serah-terima biochar dikunci UNIQUE ke satu klaim aktif; periode klaim aktif tidak boleh tumpang-tindih. Status tetap "verifikasi internal, bukan kredit" sampai VVB &amp; SRN-PPI.</w:t>
             </w:r>
           </w:p>
         </w:tc>
@@ -8276,17 +8296,117 @@
                 <w:color w:val="212121"/>
                 <w:sz w:val="19"/>
               </w:rPr>
-              <w:t>Sebagian.</w:t>
-            </w:r>
-            <w:r>
-              <w:rPr>
-                <w:rFonts w:ascii="Calibri" w:hAnsi="Calibri"/>
-                <w:b w:val="0"/>
-                <w:i w:val="0"/>
-                <w:color w:val="212121"/>
-                <w:sz w:val="19"/>
-              </w:rPr>
-              <w:t xml:space="preserve"> Geofence 500 m ditandai untuk auditor. Lanjutan: QR ber-HMAC (M).</w:t>
+              <w:t>Ditutup.</w:t>
+            </w:r>
+            <w:r>
+              <w:rPr>
+                <w:rFonts w:ascii="Calibri" w:hAnsi="Calibri"/>
+                <w:b w:val="0"/>
+                <w:i w:val="0"/>
+                <w:color w:val="212121"/>
+                <w:sz w:val="19"/>
+              </w:rPr>
+              <w:t xml:space="preserve"> Geofence 500 m ditandai untuk auditor. QR baru </w:t>
+            </w:r>
+            <w:r>
+              <w:rPr>
+                <w:rFonts w:ascii="Consolas" w:hAnsi="Consolas"/>
+                <w:b w:val="0"/>
+                <w:i w:val="0"/>
+                <w:color w:val="00695C"/>
+                <w:sz w:val="18"/>
+              </w:rPr>
+              <w:t>BIO-XXXXXXXX-TTTTTT</w:t>
+            </w:r>
+            <w:r>
+              <w:rPr>
+                <w:rFonts w:ascii="Calibri" w:hAnsi="Calibri"/>
+                <w:b w:val="0"/>
+                <w:i w:val="0"/>
+                <w:color w:val="212121"/>
+                <w:sz w:val="19"/>
+              </w:rPr>
+              <w:t xml:space="preserve"> bertanda tangan HMAC (</w:t>
+            </w:r>
+            <w:r>
+              <w:rPr>
+                <w:rFonts w:ascii="Consolas" w:hAnsi="Consolas"/>
+                <w:b w:val="0"/>
+                <w:i w:val="0"/>
+                <w:color w:val="00695C"/>
+                <w:sz w:val="18"/>
+              </w:rPr>
+              <w:t>QR_HMAC_KEY</w:t>
+            </w:r>
+            <w:r>
+              <w:rPr>
+                <w:rFonts w:ascii="Calibri" w:hAnsi="Calibri"/>
+                <w:b w:val="0"/>
+                <w:i w:val="0"/>
+                <w:color w:val="212121"/>
+                <w:sz w:val="19"/>
+              </w:rPr>
+              <w:t xml:space="preserve">); rute supir membawa digest satu arah sehingga QR dicocokkan di lokasi </w:t>
+            </w:r>
+            <w:r>
+              <w:rPr>
+                <w:rFonts w:ascii="Calibri" w:hAnsi="Calibri"/>
+                <w:b/>
+                <w:i w:val="0"/>
+                <w:color w:val="212121"/>
+                <w:sz w:val="19"/>
+              </w:rPr>
+              <w:t>tanpa sinyal</w:t>
+            </w:r>
+            <w:r>
+              <w:rPr>
+                <w:rFonts w:ascii="Calibri" w:hAnsi="Calibri"/>
+                <w:b w:val="0"/>
+                <w:i w:val="0"/>
+                <w:color w:val="212121"/>
+                <w:sz w:val="19"/>
+              </w:rPr>
+              <w:t xml:space="preserve"> tanpa membocorkan kode. QR lama tercetak tetap diterima &amp; ditandai </w:t>
+            </w:r>
+            <w:r>
+              <w:rPr>
+                <w:rFonts w:ascii="Consolas" w:hAnsi="Consolas"/>
+                <w:b w:val="0"/>
+                <w:i w:val="0"/>
+                <w:color w:val="00695C"/>
+                <w:sz w:val="18"/>
+              </w:rPr>
+              <w:t>QR_LAMA</w:t>
+            </w:r>
+            <w:r>
+              <w:rPr>
+                <w:rFonts w:ascii="Calibri" w:hAnsi="Calibri"/>
+                <w:b w:val="0"/>
+                <w:i w:val="0"/>
+                <w:color w:val="212121"/>
+                <w:sz w:val="19"/>
+              </w:rPr>
+              <w:t xml:space="preserve"> selama </w:t>
+            </w:r>
+            <w:r>
+              <w:rPr>
+                <w:rFonts w:ascii="Consolas" w:hAnsi="Consolas"/>
+                <w:b w:val="0"/>
+                <w:i w:val="0"/>
+                <w:color w:val="00695C"/>
+                <w:sz w:val="18"/>
+              </w:rPr>
+              <w:t>logistik.qr_legacy_policy</w:t>
+            </w:r>
+            <w:r>
+              <w:rPr>
+                <w:rFonts w:ascii="Calibri" w:hAnsi="Calibri"/>
+                <w:b w:val="0"/>
+                <w:i w:val="0"/>
+                <w:color w:val="212121"/>
+                <w:sz w:val="19"/>
+              </w:rPr>
+              <w:t xml:space="preserve"> = terima_tandai.</w:t>
             </w:r>
           </w:p>
         </w:tc>
@@ -8844,17 +8964,17 @@
                 <w:color w:val="212121"/>
                 <w:sz w:val="19"/>
               </w:rPr>
-              <w:t>Ditutup sebagian.</w:t>
-            </w:r>
-            <w:r>
-              <w:rPr>
-                <w:rFonts w:ascii="Calibri" w:hAnsi="Calibri"/>
-                <w:b w:val="0"/>
-                <w:i w:val="0"/>
-                <w:color w:val="212121"/>
-                <w:sz w:val="19"/>
-              </w:rPr>
-              <w:t xml:space="preserve"> Antrean terikat </w:t>
+              <w:t>Ditutup.</w:t>
+            </w:r>
+            <w:r>
+              <w:rPr>
+                <w:rFonts w:ascii="Calibri" w:hAnsi="Calibri"/>
+                <w:b w:val="0"/>
+                <w:i w:val="0"/>
+                <w:color w:val="212121"/>
+                <w:sz w:val="19"/>
+              </w:rPr>
+              <w:t xml:space="preserve"> Antrean, foto &amp; titik GPS terikat </w:t>
             </w:r>
             <w:r>
               <w:rPr>
@@ -8874,7 +8994,7 @@
                 <w:color w:val="212121"/>
                 <w:sz w:val="19"/>
               </w:rPr>
-              <w:t xml:space="preserve"> dan dikirim saat pemiliknya login lagi.</w:t>
+              <w:t xml:space="preserve"> + nama pemilik; supir lain tidak lagi mengirim (lalu menghapus) jejak GPS pemilik; cache rute per pengguna; saat login muncul pemberitahuan "N data offline milik … menunggu".</w:t>
             </w:r>
           </w:p>
         </w:tc>
@@ -9010,7 +9130,7 @@
           <w:color w:val="212121"/>
           <w:sz w:val="21"/>
         </w:rPr>
-        <w:t xml:space="preserve">Status 2026-10-10: 16 dari 19 temuan </w:t>
+        <w:t xml:space="preserve">Status 2026-10-11: </w:t>
       </w:r>
       <w:r>
         <w:rPr>
@@ -9020,7 +9140,7 @@
           <w:color w:val="212121"/>
           <w:sz w:val="21"/>
         </w:rPr>
-        <w:t>ditutup atau ditutup-dasar</w:t>
+        <w:t>19 dari 19 temuan ditutup atau ditutup-dasar</w:t>
       </w:r>
       <w:r>
         <w:rPr>
@@ -9030,17 +9150,17 @@
           <w:color w:val="212121"/>
           <w:sz w:val="21"/>
         </w:rPr>
-        <w:t xml:space="preserve">; </w:t>
+        <w:t xml:space="preserve"> (F11, F14, F18 ditutup — rincian </w:t>
       </w:r>
       <w:r>
         <w:rPr>
-          <w:rFonts w:ascii="Calibri" w:hAnsi="Calibri"/>
-          <w:b/>
+          <w:rFonts w:ascii="Consolas" w:hAnsi="Consolas"/>
+          <w:b w:val="0"/>
           <w:i w:val="0"/>
-          <w:color w:val="212121"/>
-          <w:sz w:val="21"/>
+          <w:color w:val="00695C"/>
+          <w:sz w:val="20"/>
         </w:rPr>
-        <w:t>F11, F14, dan F18 masih sebagian</w:t>
+        <w:t>docs/14_PENUTUPAN_F11_F14_F18.md</w:t>
       </w:r>
       <w:r>
         <w:rPr>
@@ -9050,7 +9170,7 @@
           <w:color w:val="212121"/>
           <w:sz w:val="21"/>
         </w:rPr>
-        <w:t xml:space="preserve"> (lihat tabel). Uji: 468 lulus di PostgreSQL, 455 lulus di SQLite. Sebelum pilot tinggal langkah server: jalankan certbot (F4), isi </w:t>
+        <w:t xml:space="preserve">; OTP F6 opsional). Uji: 486 lulus di SQLite (+6 SLO latensi dijalankan terpisah), uji PG+RLS lulus, 16 spec e2e lulus. Sebelum pilot tinggal langkah server: jalankan certbot (F4), isi </w:t>
       </w:r>
       <w:r>
         <w:rPr>
@@ -9142,7 +9262,27 @@
           <w:color w:val="212121"/>
           <w:sz w:val="21"/>
         </w:rPr>
-        <w:t>Setelah itu, sebelum klaim karbon: F11 dan uji lab C_org.</w:t>
+        <w:t xml:space="preserve">Setelah itu, sebelum klaim karbon publik: klaim F11 terverifikasi auditor internal + uji lab C_org per periode, lalu VVB &amp; SRN-PPI. Isi </w:t>
+      </w:r>
+      <w:r>
+        <w:rPr>
+          <w:rFonts w:ascii="Consolas" w:hAnsi="Consolas"/>
+          <w:b w:val="0"/>
+          <w:i w:val="0"/>
+          <w:color w:val="00695C"/>
+          <w:sz w:val="20"/>
+        </w:rPr>
+        <w:t>QR_HMAC_KEY</w:t>
+      </w:r>
+      <w:r>
+        <w:rPr>
+          <w:rFonts w:ascii="Calibri" w:hAnsi="Calibri"/>
+          <w:b w:val="0"/>
+          <w:i w:val="0"/>
+          <w:color w:val="212121"/>
+          <w:sz w:val="21"/>
+        </w:rPr>
+        <w:t xml:space="preserve"> sebelum mencetak QR baru.</w:t>
       </w:r>
     </w:p>
     <w:p>

</xml_diff>